<commit_message>
added deliverable 4 files
</commit_message>
<xml_diff>
--- a/Deliverable3/Deliverable 3.docx
+++ b/Deliverable3/Deliverable 3.docx
@@ -119,6 +119,53 @@
     </w:p>
     <w:p>
       <w:pPr>
+        <w:spacing w:after="0" w:line="480" w:lineRule="auto"/>
+        <w:ind w:firstLine="720"/>
+        <w:jc w:val="center"/>
+        <w:rPr>
+          <w:rFonts w:ascii="Times New Roman" w:hAnsi="Times New Roman" w:cs="Times New Roman"/>
+          <w:b/>
+          <w:sz w:val="24"/>
+          <w:szCs w:val="24"/>
+          <w:lang w:val="en-US"/>
+        </w:rPr>
+      </w:pPr>
+      <w:r>
+        <w:rPr>
+          <w:rFonts w:ascii="Times New Roman" w:hAnsi="Times New Roman" w:cs="Times New Roman"/>
+          <w:b/>
+          <w:sz w:val="24"/>
+          <w:szCs w:val="24"/>
+          <w:lang w:val="en-US"/>
+        </w:rPr>
+        <w:t>Vikram Reddy Tekula, Raghav Gurram</w:t>
+      </w:r>
+      <w:r>
+        <w:rPr>
+          <w:rFonts w:ascii="Times New Roman" w:hAnsi="Times New Roman" w:cs="Times New Roman"/>
+          <w:b/>
+          <w:sz w:val="24"/>
+          <w:szCs w:val="24"/>
+          <w:lang w:val="en-US"/>
+        </w:rPr>
+        <w:br/>
+        <w:t xml:space="preserve">Shiva Gowtham Kumar, Sri Varshini </w:t>
+      </w:r>
+      <w:proofErr w:type="spellStart"/>
+      <w:r>
+        <w:rPr>
+          <w:rFonts w:ascii="Times New Roman" w:hAnsi="Times New Roman" w:cs="Times New Roman"/>
+          <w:b/>
+          <w:sz w:val="24"/>
+          <w:szCs w:val="24"/>
+          <w:lang w:val="en-US"/>
+        </w:rPr>
+        <w:t>Sukhamanchi</w:t>
+      </w:r>
+      <w:proofErr w:type="spellEnd"/>
+    </w:p>
+    <w:p>
+      <w:pPr>
         <w:spacing w:line="480" w:lineRule="auto"/>
         <w:jc w:val="center"/>
         <w:rPr>
@@ -171,34 +218,6 @@
         <w:rPr>
           <w:rFonts w:ascii="Times New Roman" w:hAnsi="Times New Roman" w:cs="Times New Roman"/>
           <w:b/>
-          <w:sz w:val="24"/>
-          <w:szCs w:val="24"/>
-          <w:lang w:val="en-US"/>
-        </w:rPr>
-      </w:pPr>
-    </w:p>
-    <w:p>
-      <w:pPr>
-        <w:spacing w:after="0" w:line="480" w:lineRule="auto"/>
-        <w:ind w:firstLine="720"/>
-        <w:rPr>
-          <w:rFonts w:ascii="Times New Roman" w:hAnsi="Times New Roman" w:cs="Times New Roman"/>
-          <w:b/>
-          <w:bCs/>
-          <w:sz w:val="24"/>
-          <w:szCs w:val="24"/>
-          <w:lang w:val="en-US"/>
-        </w:rPr>
-      </w:pPr>
-    </w:p>
-    <w:p>
-      <w:pPr>
-        <w:spacing w:after="0" w:line="480" w:lineRule="auto"/>
-        <w:ind w:firstLine="720"/>
-        <w:rPr>
-          <w:rFonts w:ascii="Times New Roman" w:hAnsi="Times New Roman" w:cs="Times New Roman"/>
-          <w:b/>
-          <w:bCs/>
           <w:sz w:val="24"/>
           <w:szCs w:val="24"/>
           <w:lang w:val="en-US"/>
@@ -1111,7 +1130,7 @@
         </w:rPr>
         <w:lastRenderedPageBreak/>
         <w:drawing>
-          <wp:inline distT="0" distB="0" distL="0" distR="0" wp14:anchorId="1A9BF9B2" wp14:editId="6772AEF1">
+          <wp:inline distT="0" distB="0" distL="0" distR="0" wp14:anchorId="1A9BF9B2" wp14:editId="06F5B2D5">
             <wp:extent cx="5731510" cy="3591560"/>
             <wp:effectExtent l="0" t="0" r="2540" b="8890"/>
             <wp:docPr id="1670053056" name="Picture 1"/>
@@ -1281,7 +1300,7 @@
         </w:rPr>
         <w:lastRenderedPageBreak/>
         <w:drawing>
-          <wp:inline distT="0" distB="0" distL="0" distR="0" wp14:anchorId="0FC8BFE7" wp14:editId="5C442572">
+          <wp:inline distT="0" distB="0" distL="0" distR="0" wp14:anchorId="0FC8BFE7" wp14:editId="5F34C851">
             <wp:extent cx="5730399" cy="3685309"/>
             <wp:effectExtent l="0" t="0" r="3810" b="0"/>
             <wp:docPr id="1711440639" name="Picture 3"/>
@@ -1462,7 +1481,7 @@
           <w:lang w:val="en-US"/>
         </w:rPr>
         <w:drawing>
-          <wp:inline distT="0" distB="0" distL="0" distR="0" wp14:anchorId="6DE243DD" wp14:editId="415B5257">
+          <wp:inline distT="0" distB="0" distL="0" distR="0" wp14:anchorId="6DE243DD" wp14:editId="2FD37B7A">
             <wp:extent cx="5731510" cy="3591560"/>
             <wp:effectExtent l="0" t="0" r="2540" b="8890"/>
             <wp:docPr id="65023924" name="Picture 2"/>

</xml_diff>